<commit_message>
Voix, portrait, vidéo et musique inclus ; prénom, âge et lieux réglables dans l'appli
Admin › Réglages › Personnaliser : {{prenom}}, {{age}} (bloc params du contenu)
et les lieux de chaque météo, sans recompiler. La voix finale_5 est retirée
(elle prononçait le prénom) et sa version à dire n'a plus de prénom.

Co-Authored-By: Claude Opus 5.5 <noreply@anthropic.com>
</commit_message>
<xml_diff>
--- a/documents/voix-mission-sophie.docx
+++ b/documents/voix-mission-sophie.docx
@@ -21022,7 +21022,22 @@
                 <w:sz w:val="18"/>
                 <w:szCs w:val="18"/>
               </w:rPr>
-              <w:t xml:space="preserve">Et n'oublions pas : joyeux anniversaire, [prénom] ! Rendez-vous pour le gâteau, le Maître du jeu a une surprise pour chacune de vous.</w:t>
+              <w:t xml:space="preserve">Et n'oublions pas : joyeux anniversaire ! Rendez-vous pour le gâteau, le Maître du jeu a une surprise pour chacune de vous.</w:t>
+            </w:r>
+          </w:p>
+          <w:p>
+            <w:pPr>
+              <w:spacing w:after="0"/>
+            </w:pPr>
+            <w:r>
+              <w:rPr>
+                <w:i/>
+                <w:iCs/>
+                <w:color w:val="8A6D00"/>
+                <w:sz w:val="14"/>
+                <w:szCs w:val="14"/>
+              </w:rPr>
+              <w:t xml:space="preserve">Sans le prénom (réglable dans l’appli, il reste écrit à l’écran).</w:t>
             </w:r>
           </w:p>
         </w:tc>

</xml_diff>